<commit_message>
Added Stacked Bar Chart visualization.
</commit_message>
<xml_diff>
--- a/docs/PDA_data_dictionary.docx
+++ b/docs/PDA_data_dictionary.docx
@@ -43,7 +43,7 @@
     </w:p>
     <w:p>
       <w:r>
-        <w:t>Live counts from data/pda.db as of 2026-06-06.</w:t>
+        <w:t>Live counts from data/pda.db as of 2026-06-14.</w:t>
       </w:r>
     </w:p>
     <w:p>
@@ -2186,6 +2186,41 @@
           <w:p>
             <w:r/>
             <w:r>
+              <w:t>total_cost_estimate</w:t>
+            </w:r>
+          </w:p>
+        </w:tc>
+        <w:tc>
+          <w:tcPr>
+            <w:tcW w:type="dxa" w:w="2448"/>
+          </w:tcPr>
+          <w:p>
+            <w:r/>
+            <w:r>
+              <w:t>number or null (generated)</w:t>
+            </w:r>
+          </w:p>
+        </w:tc>
+        <w:tc>
+          <w:tcPr>
+            <w:tcW w:type="dxa" w:w="4896"/>
+          </w:tcPr>
+          <w:p>
+            <w:r/>
+            <w:r>
+              <w:t>Total disaster cost ($): ia_cost_estimate + pa_cost_estimate, treating a missing side as $0; null only when both are absent. A SQLite VIRTUAL generated column, recomputed on read.</w:t>
+            </w:r>
+          </w:p>
+        </w:tc>
+      </w:tr>
+      <w:tr>
+        <w:tc>
+          <w:tcPr>
+            <w:tcW w:type="dxa" w:w="3024"/>
+          </w:tcPr>
+          <w:p>
+            <w:r/>
+            <w:r>
               <w:t>pa_statewide_per_capita</w:t>
             </w:r>
           </w:p>
@@ -3010,6 +3045,14 @@
         <w:pStyle w:val="ListBullet"/>
       </w:pPr>
       <w:r>
+        <w:t>total_cost_estimate is a VIRTUAL generated column (computed from ia_cost_estimate + pa_cost_estimate, never stored), so it self-updates and never goes stale. It appears in SELECT * and queries by name, but NOT in PRAGMA table_info — use PRAGMA table_xinfo to enumerate it programmatically.</w:t>
+      </w:r>
+    </w:p>
+    <w:p>
+      <w:pPr>
+        <w:pStyle w:val="ListBullet"/>
+      </w:pPr>
+      <w:r>
         <w:t>Dates are stored as YYYY-MM-DD strings (lexically sortable); cast in your analysis tool as needed.</w:t>
       </w:r>
     </w:p>
@@ -3572,509 +3615,6 @@
         <w:t>needs_review: true if the document departs from this structure or any required field is ambiguous; put a short reason in review_note. No derived fields — return only raw facts.</w:t>
       </w:r>
     </w:p>
-    <w:p>
-      <w:pPr>
-        <w:pStyle w:val="Heading1"/>
-      </w:pPr>
-      <w:r>
-        <w:t>Cost-Estimate Coverage and Variability</w:t>
-      </w:r>
-    </w:p>
-    <w:p>
-      <w:r>
-        <w:t>Analysis of the ia_cost_estimate and pa_cost_estimate fields across all 1,378 reports. “Approved” covers reports with outcome “Declared”; “Denied” combines “Denied” and “Denial of Appeal”. UNK/Unknown values were already stored as null and are counted as missing.</w:t>
-      </w:r>
-    </w:p>
-    <w:p>
-      <w:pPr>
-        <w:pStyle w:val="Heading2"/>
-      </w:pPr>
-      <w:r>
-        <w:t>Estimate coverage by outcome</w:t>
-      </w:r>
-    </w:p>
-    <w:p>
-      <w:r>
-        <w:t>Counts of reports that report both cost estimates, exactly one, or neither.</w:t>
-      </w:r>
-    </w:p>
-    <w:tbl>
-      <w:tblPr>
-        <w:tblStyle w:val="LightGrid-Accent1"/>
-        <w:tblW w:type="auto" w:w="0"/>
-        <w:tblLook w:firstColumn="1" w:firstRow="1" w:lastColumn="0" w:lastRow="0" w:noHBand="0" w:noVBand="1" w:val="04A0"/>
-      </w:tblPr>
-      <w:tblGrid>
-        <w:gridCol w:w="1728"/>
-        <w:gridCol w:w="1728"/>
-        <w:gridCol w:w="1728"/>
-        <w:gridCol w:w="1728"/>
-        <w:gridCol w:w="1728"/>
-      </w:tblGrid>
-      <w:tr>
-        <w:tc>
-          <w:tcPr>
-            <w:tcW w:type="dxa" w:w="1728"/>
-          </w:tcPr>
-          <w:p>
-            <w:r>
-              <w:t>Outcome</w:t>
-            </w:r>
-          </w:p>
-        </w:tc>
-        <w:tc>
-          <w:tcPr>
-            <w:tcW w:type="dxa" w:w="1728"/>
-          </w:tcPr>
-          <w:p>
-            <w:r>
-              <w:t>Both estimates</w:t>
-            </w:r>
-          </w:p>
-        </w:tc>
-        <w:tc>
-          <w:tcPr>
-            <w:tcW w:type="dxa" w:w="1728"/>
-          </w:tcPr>
-          <w:p>
-            <w:r>
-              <w:t>Only one estimate</w:t>
-            </w:r>
-          </w:p>
-        </w:tc>
-        <w:tc>
-          <w:tcPr>
-            <w:tcW w:type="dxa" w:w="1728"/>
-          </w:tcPr>
-          <w:p>
-            <w:r>
-              <w:t>Neither estimate</w:t>
-            </w:r>
-          </w:p>
-        </w:tc>
-        <w:tc>
-          <w:tcPr>
-            <w:tcW w:type="dxa" w:w="1728"/>
-          </w:tcPr>
-          <w:p>
-            <w:r>
-              <w:t>Total reports</w:t>
-            </w:r>
-          </w:p>
-        </w:tc>
-      </w:tr>
-      <w:tr>
-        <w:tc>
-          <w:tcPr>
-            <w:tcW w:type="dxa" w:w="1728"/>
-          </w:tcPr>
-          <w:p>
-            <w:r>
-              <w:t>Approved</w:t>
-            </w:r>
-          </w:p>
-        </w:tc>
-        <w:tc>
-          <w:tcPr>
-            <w:tcW w:type="dxa" w:w="1728"/>
-          </w:tcPr>
-          <w:p>
-            <w:r>
-              <w:t>250</w:t>
-            </w:r>
-          </w:p>
-        </w:tc>
-        <w:tc>
-          <w:tcPr>
-            <w:tcW w:type="dxa" w:w="1728"/>
-          </w:tcPr>
-          <w:p>
-            <w:r>
-              <w:t>773</w:t>
-            </w:r>
-          </w:p>
-        </w:tc>
-        <w:tc>
-          <w:tcPr>
-            <w:tcW w:type="dxa" w:w="1728"/>
-          </w:tcPr>
-          <w:p>
-            <w:r>
-              <w:t>154</w:t>
-            </w:r>
-          </w:p>
-        </w:tc>
-        <w:tc>
-          <w:tcPr>
-            <w:tcW w:type="dxa" w:w="1728"/>
-          </w:tcPr>
-          <w:p>
-            <w:r>
-              <w:t>1177</w:t>
-            </w:r>
-          </w:p>
-        </w:tc>
-      </w:tr>
-      <w:tr>
-        <w:tc>
-          <w:tcPr>
-            <w:tcW w:type="dxa" w:w="1728"/>
-          </w:tcPr>
-          <w:p>
-            <w:r>
-              <w:t>Denied</w:t>
-            </w:r>
-          </w:p>
-        </w:tc>
-        <w:tc>
-          <w:tcPr>
-            <w:tcW w:type="dxa" w:w="1728"/>
-          </w:tcPr>
-          <w:p>
-            <w:r>
-              <w:t>35</w:t>
-            </w:r>
-          </w:p>
-        </w:tc>
-        <w:tc>
-          <w:tcPr>
-            <w:tcW w:type="dxa" w:w="1728"/>
-          </w:tcPr>
-          <w:p>
-            <w:r>
-              <w:t>163</w:t>
-            </w:r>
-          </w:p>
-        </w:tc>
-        <w:tc>
-          <w:tcPr>
-            <w:tcW w:type="dxa" w:w="1728"/>
-          </w:tcPr>
-          <w:p>
-            <w:r>
-              <w:t>3</w:t>
-            </w:r>
-          </w:p>
-        </w:tc>
-        <w:tc>
-          <w:tcPr>
-            <w:tcW w:type="dxa" w:w="1728"/>
-          </w:tcPr>
-          <w:p>
-            <w:r>
-              <w:t>201</w:t>
-            </w:r>
-          </w:p>
-        </w:tc>
-      </w:tr>
-    </w:tbl>
-    <w:p>
-      <w:pPr>
-        <w:pStyle w:val="Heading2"/>
-      </w:pPr>
-      <w:r>
-        <w:t>Spread of cost estimates by outcome</w:t>
-      </w:r>
-    </w:p>
-    <w:p>
-      <w:r>
-        <w:t>Minimum, maximum, and sample standard deviation (n−1) of each cost estimate in U.S. dollars, computed over the non-null values only; n is the count of reports contributing to each figure.</w:t>
-      </w:r>
-    </w:p>
-    <w:tbl>
-      <w:tblPr>
-        <w:tblStyle w:val="LightGrid-Accent1"/>
-        <w:tblW w:type="auto" w:w="0"/>
-        <w:tblLook w:firstColumn="1" w:firstRow="1" w:lastColumn="0" w:lastRow="0" w:noHBand="0" w:noVBand="1" w:val="04A0"/>
-      </w:tblPr>
-      <w:tblGrid>
-        <w:gridCol w:w="960"/>
-        <w:gridCol w:w="960"/>
-        <w:gridCol w:w="960"/>
-        <w:gridCol w:w="960"/>
-        <w:gridCol w:w="960"/>
-        <w:gridCol w:w="960"/>
-        <w:gridCol w:w="960"/>
-        <w:gridCol w:w="960"/>
-        <w:gridCol w:w="960"/>
-      </w:tblGrid>
-      <w:tr>
-        <w:tc>
-          <w:tcPr>
-            <w:tcW w:type="dxa" w:w="960"/>
-          </w:tcPr>
-          <w:p>
-            <w:r>
-              <w:t>Outcome</w:t>
-            </w:r>
-          </w:p>
-        </w:tc>
-        <w:tc>
-          <w:tcPr>
-            <w:tcW w:type="dxa" w:w="960"/>
-          </w:tcPr>
-          <w:p>
-            <w:r>
-              <w:t>IA n</w:t>
-            </w:r>
-          </w:p>
-        </w:tc>
-        <w:tc>
-          <w:tcPr>
-            <w:tcW w:type="dxa" w:w="960"/>
-          </w:tcPr>
-          <w:p>
-            <w:r>
-              <w:t>IA min</w:t>
-            </w:r>
-          </w:p>
-        </w:tc>
-        <w:tc>
-          <w:tcPr>
-            <w:tcW w:type="dxa" w:w="960"/>
-          </w:tcPr>
-          <w:p>
-            <w:r>
-              <w:t>IA max</w:t>
-            </w:r>
-          </w:p>
-        </w:tc>
-        <w:tc>
-          <w:tcPr>
-            <w:tcW w:type="dxa" w:w="960"/>
-          </w:tcPr>
-          <w:p>
-            <w:r>
-              <w:t>IA std dev</w:t>
-            </w:r>
-          </w:p>
-        </w:tc>
-        <w:tc>
-          <w:tcPr>
-            <w:tcW w:type="dxa" w:w="960"/>
-          </w:tcPr>
-          <w:p>
-            <w:r>
-              <w:t>PA n</w:t>
-            </w:r>
-          </w:p>
-        </w:tc>
-        <w:tc>
-          <w:tcPr>
-            <w:tcW w:type="dxa" w:w="960"/>
-          </w:tcPr>
-          <w:p>
-            <w:r>
-              <w:t>PA min</w:t>
-            </w:r>
-          </w:p>
-        </w:tc>
-        <w:tc>
-          <w:tcPr>
-            <w:tcW w:type="dxa" w:w="960"/>
-          </w:tcPr>
-          <w:p>
-            <w:r>
-              <w:t>PA max</w:t>
-            </w:r>
-          </w:p>
-        </w:tc>
-        <w:tc>
-          <w:tcPr>
-            <w:tcW w:type="dxa" w:w="960"/>
-          </w:tcPr>
-          <w:p>
-            <w:r>
-              <w:t>PA std dev</w:t>
-            </w:r>
-          </w:p>
-        </w:tc>
-      </w:tr>
-      <w:tr>
-        <w:tc>
-          <w:tcPr>
-            <w:tcW w:type="dxa" w:w="960"/>
-          </w:tcPr>
-          <w:p>
-            <w:r>
-              <w:t>Approved</w:t>
-            </w:r>
-          </w:p>
-        </w:tc>
-        <w:tc>
-          <w:tcPr>
-            <w:tcW w:type="dxa" w:w="960"/>
-          </w:tcPr>
-          <w:p>
-            <w:r>
-              <w:t>383</w:t>
-            </w:r>
-          </w:p>
-        </w:tc>
-        <w:tc>
-          <w:tcPr>
-            <w:tcW w:type="dxa" w:w="960"/>
-          </w:tcPr>
-          <w:p>
-            <w:r>
-              <w:t>$0</w:t>
-            </w:r>
-          </w:p>
-        </w:tc>
-        <w:tc>
-          <w:tcPr>
-            <w:tcW w:type="dxa" w:w="960"/>
-          </w:tcPr>
-          <w:p>
-            <w:r>
-              <w:t>$87,053,819</w:t>
-            </w:r>
-          </w:p>
-        </w:tc>
-        <w:tc>
-          <w:tcPr>
-            <w:tcW w:type="dxa" w:w="960"/>
-          </w:tcPr>
-          <w:p>
-            <w:r>
-              <w:t>$9,531,172</w:t>
-            </w:r>
-          </w:p>
-        </w:tc>
-        <w:tc>
-          <w:tcPr>
-            <w:tcW w:type="dxa" w:w="960"/>
-          </w:tcPr>
-          <w:p>
-            <w:r>
-              <w:t>890</w:t>
-            </w:r>
-          </w:p>
-        </w:tc>
-        <w:tc>
-          <w:tcPr>
-            <w:tcW w:type="dxa" w:w="960"/>
-          </w:tcPr>
-          <w:p>
-            <w:r>
-              <w:t>$201,580</w:t>
-            </w:r>
-          </w:p>
-        </w:tc>
-        <w:tc>
-          <w:tcPr>
-            <w:tcW w:type="dxa" w:w="960"/>
-          </w:tcPr>
-          <w:p>
-            <w:r>
-              <w:t>$537,119,780</w:t>
-            </w:r>
-          </w:p>
-        </w:tc>
-        <w:tc>
-          <w:tcPr>
-            <w:tcW w:type="dxa" w:w="960"/>
-          </w:tcPr>
-          <w:p>
-            <w:r>
-              <w:t>$28,392,133</w:t>
-            </w:r>
-          </w:p>
-        </w:tc>
-      </w:tr>
-      <w:tr>
-        <w:tc>
-          <w:tcPr>
-            <w:tcW w:type="dxa" w:w="960"/>
-          </w:tcPr>
-          <w:p>
-            <w:r>
-              <w:t>Denied</w:t>
-            </w:r>
-          </w:p>
-        </w:tc>
-        <w:tc>
-          <w:tcPr>
-            <w:tcW w:type="dxa" w:w="960"/>
-          </w:tcPr>
-          <w:p>
-            <w:r>
-              <w:t>112</w:t>
-            </w:r>
-          </w:p>
-        </w:tc>
-        <w:tc>
-          <w:tcPr>
-            <w:tcW w:type="dxa" w:w="960"/>
-          </w:tcPr>
-          <w:p>
-            <w:r>
-              <w:t>$0</w:t>
-            </w:r>
-          </w:p>
-        </w:tc>
-        <w:tc>
-          <w:tcPr>
-            <w:tcW w:type="dxa" w:w="960"/>
-          </w:tcPr>
-          <w:p>
-            <w:r>
-              <w:t>$88,174,574</w:t>
-            </w:r>
-          </w:p>
-        </w:tc>
-        <w:tc>
-          <w:tcPr>
-            <w:tcW w:type="dxa" w:w="960"/>
-          </w:tcPr>
-          <w:p>
-            <w:r>
-              <w:t>$9,676,909</w:t>
-            </w:r>
-          </w:p>
-        </w:tc>
-        <w:tc>
-          <w:tcPr>
-            <w:tcW w:type="dxa" w:w="960"/>
-          </w:tcPr>
-          <w:p>
-            <w:r>
-              <w:t>121</w:t>
-            </w:r>
-          </w:p>
-        </w:tc>
-        <w:tc>
-          <w:tcPr>
-            <w:tcW w:type="dxa" w:w="960"/>
-          </w:tcPr>
-          <w:p>
-            <w:r>
-              <w:t>$0</w:t>
-            </w:r>
-          </w:p>
-        </w:tc>
-        <w:tc>
-          <w:tcPr>
-            <w:tcW w:type="dxa" w:w="960"/>
-          </w:tcPr>
-          <w:p>
-            <w:r>
-              <w:t>$90,388,071</w:t>
-            </w:r>
-          </w:p>
-        </w:tc>
-        <w:tc>
-          <w:tcPr>
-            <w:tcW w:type="dxa" w:w="960"/>
-          </w:tcPr>
-          <w:p>
-            <w:r>
-              <w:t>$13,947,537</w:t>
-            </w:r>
-          </w:p>
-        </w:tc>
-      </w:tr>
-    </w:tbl>
     <w:sectPr>
       <w:pgSz w:w="12240" w:h="15840"/>
       <w:pgMar w:top="1440" w:right="1800" w:bottom="1440" w:left="1800" w:header="720" w:footer="720" w:gutter="0"/>

</xml_diff>